<commit_message>
docs: enforce .docx-only rule in _AI_EXECUTION_RULES.md and update report_lab01.docx styling
</commit_message>
<xml_diff>
--- a/docs/report_lab01.docx
+++ b/docs/report_lab01.docx
@@ -4,7 +4,7 @@
   <w:body>
     <w:p>
       <w:pPr>
-        <w:spacing w:after="100"/>
+        <w:spacing w:after="60" w:before="200"/>
         <w:jc w:val="center"/>
       </w:pPr>
       <w:r>
@@ -13,15 +13,15 @@
           <w:b/>
           <w:bCs/>
           <w:color w:val="2F7A4F"/>
-          <w:sz w:val="32"/>
-          <w:szCs w:val="32"/>
+          <w:sz w:val="36"/>
+          <w:szCs w:val="36"/>
         </w:rPr>
         <w:t xml:space="preserve">LAB 1 REPORT</w:t>
       </w:r>
     </w:p>
     <w:p>
       <w:pPr>
-        <w:spacing w:after="240"/>
+        <w:spacing w:after="300"/>
         <w:jc w:val="center"/>
       </w:pPr>
       <w:r>
@@ -29,8 +29,9 @@
           <w:rFonts w:ascii="Segoe UI" w:cs="Segoe UI" w:eastAsia="Segoe UI" w:hAnsi="Segoe UI"/>
           <w:b/>
           <w:bCs/>
-          <w:sz w:val="24"/>
-          <w:szCs w:val="24"/>
+          <w:color w:val="1E293B"/>
+          <w:sz w:val="26"/>
+          <w:szCs w:val="26"/>
         </w:rPr>
         <w:t xml:space="preserve">TokTickIT IT Service Desk Starter</w:t>
       </w:r>
@@ -55,36 +56,56 @@
         <w:tc>
           <w:tcPr>
             <w:tcW w:type="pct" w:w="30%"/>
-          </w:tcPr>
-          <w:p>
-            <w:pPr>
-              <w:spacing w:after="120"/>
+            <w:tcBorders>
+              <w:top w:val="single" w:color="CBD5E1" w:sz="4"/>
+              <w:left w:val="single" w:color="CBD5E1" w:sz="4"/>
+              <w:bottom w:val="single" w:color="CBD5E1" w:sz="4"/>
+              <w:right w:val="single" w:color="CBD5E1" w:sz="4"/>
+            </w:tcBorders>
+            <w:shd w:fill="2F7A4F" w:val="clear"/>
+          </w:tcPr>
+          <w:p>
+            <w:pPr>
+              <w:spacing w:after="60" w:before="60"/>
             </w:pPr>
             <w:r>
               <w:rPr>
                 <w:rFonts w:ascii="Segoe UI" w:cs="Segoe UI" w:eastAsia="Segoe UI" w:hAnsi="Segoe UI"/>
                 <w:b/>
                 <w:bCs/>
-              </w:rPr>
-              <w:t xml:space="preserve">Author / GitHub</w:t>
+                <w:color w:val="FFFFFF"/>
+                <w:sz w:val="20"/>
+                <w:szCs w:val="20"/>
+              </w:rPr>
+              <w:t xml:space="preserve">Field Key</w:t>
             </w:r>
           </w:p>
         </w:tc>
         <w:tc>
           <w:tcPr>
             <w:tcW w:type="pct" w:w="70%"/>
-          </w:tcPr>
-          <w:p>
-            <w:pPr>
-              <w:spacing w:after="120"/>
-            </w:pPr>
-            <w:r>
-              <w:rPr>
-                <w:rFonts w:ascii="Segoe UI" w:cs="Segoe UI" w:eastAsia="Segoe UI" w:hAnsi="Segoe UI"/>
-                <w:b w:val="false"/>
-                <w:bCs w:val="false"/>
-              </w:rPr>
-              <w:t xml:space="preserve">Vieng (@vienggg)</w:t>
+            <w:tcBorders>
+              <w:top w:val="single" w:color="CBD5E1" w:sz="4"/>
+              <w:left w:val="single" w:color="CBD5E1" w:sz="4"/>
+              <w:bottom w:val="single" w:color="CBD5E1" w:sz="4"/>
+              <w:right w:val="single" w:color="CBD5E1" w:sz="4"/>
+            </w:tcBorders>
+            <w:shd w:fill="2F7A4F" w:val="clear"/>
+          </w:tcPr>
+          <w:p>
+            <w:pPr>
+              <w:spacing w:after="60" w:before="60"/>
+            </w:pPr>
+            <w:r>
+              <w:rPr>
+                <w:rFonts w:ascii="Segoe UI" w:cs="Segoe UI" w:eastAsia="Segoe UI" w:hAnsi="Segoe UI"/>
+                <w:b/>
+                <w:bCs/>
+                <w:color w:val="FFFFFF"/>
+                <w:sz w:val="20"/>
+                <w:szCs w:val="20"/>
+              </w:rPr>
+              <w:t xml:space="preserve">Specification / Value</w:t>
             </w:r>
           </w:p>
         </w:tc>
@@ -93,36 +114,54 @@
         <w:tc>
           <w:tcPr>
             <w:tcW w:type="pct" w:w="30%"/>
-          </w:tcPr>
-          <w:p>
-            <w:pPr>
-              <w:spacing w:after="120"/>
-            </w:pPr>
-            <w:r>
-              <w:rPr>
-                <w:rFonts w:ascii="Segoe UI" w:cs="Segoe UI" w:eastAsia="Segoe UI" w:hAnsi="Segoe UI"/>
-                <w:b/>
-                <w:bCs/>
-              </w:rPr>
-              <w:t xml:space="preserve">Peer Reviewer / GitHub</w:t>
+            <w:tcBorders>
+              <w:top w:val="single" w:color="CBD5E1" w:sz="4"/>
+              <w:left w:val="single" w:color="CBD5E1" w:sz="4"/>
+              <w:bottom w:val="single" w:color="CBD5E1" w:sz="4"/>
+              <w:right w:val="single" w:color="CBD5E1" w:sz="4"/>
+            </w:tcBorders>
+          </w:tcPr>
+          <w:p>
+            <w:pPr>
+              <w:spacing w:after="60" w:before="60"/>
+            </w:pPr>
+            <w:r>
+              <w:rPr>
+                <w:rFonts w:ascii="Segoe UI" w:cs="Segoe UI" w:eastAsia="Segoe UI" w:hAnsi="Segoe UI"/>
+                <w:b w:val="false"/>
+                <w:bCs w:val="false"/>
+                <w:color w:val="0F172A"/>
+                <w:sz w:val="20"/>
+                <w:szCs w:val="20"/>
+              </w:rPr>
+              <w:t xml:space="preserve">Author (GitHub)</w:t>
             </w:r>
           </w:p>
         </w:tc>
         <w:tc>
           <w:tcPr>
             <w:tcW w:type="pct" w:w="70%"/>
-          </w:tcPr>
-          <w:p>
-            <w:pPr>
-              <w:spacing w:after="120"/>
-            </w:pPr>
-            <w:r>
-              <w:rPr>
-                <w:rFonts w:ascii="Segoe UI" w:cs="Segoe UI" w:eastAsia="Segoe UI" w:hAnsi="Segoe UI"/>
-                <w:b w:val="false"/>
-                <w:bCs w:val="false"/>
-              </w:rPr>
-              <w:t xml:space="preserve">Dechayut (@NinjoMUDA)</w:t>
+            <w:tcBorders>
+              <w:top w:val="single" w:color="CBD5E1" w:sz="4"/>
+              <w:left w:val="single" w:color="CBD5E1" w:sz="4"/>
+              <w:bottom w:val="single" w:color="CBD5E1" w:sz="4"/>
+              <w:right w:val="single" w:color="CBD5E1" w:sz="4"/>
+            </w:tcBorders>
+          </w:tcPr>
+          <w:p>
+            <w:pPr>
+              <w:spacing w:after="60" w:before="60"/>
+            </w:pPr>
+            <w:r>
+              <w:rPr>
+                <w:rFonts w:ascii="Segoe UI" w:cs="Segoe UI" w:eastAsia="Segoe UI" w:hAnsi="Segoe UI"/>
+                <w:b w:val="false"/>
+                <w:bCs w:val="false"/>
+                <w:color w:val="0F172A"/>
+                <w:sz w:val="20"/>
+                <w:szCs w:val="20"/>
+              </w:rPr>
+              <w:t xml:space="preserve">Vieng (@vienggg)</w:t>
             </w:r>
           </w:p>
         </w:tc>
@@ -131,36 +170,54 @@
         <w:tc>
           <w:tcPr>
             <w:tcW w:type="pct" w:w="30%"/>
-          </w:tcPr>
-          <w:p>
-            <w:pPr>
-              <w:spacing w:after="120"/>
-            </w:pPr>
-            <w:r>
-              <w:rPr>
-                <w:rFonts w:ascii="Segoe UI" w:cs="Segoe UI" w:eastAsia="Segoe UI" w:hAnsi="Segoe UI"/>
-                <w:b/>
-                <w:bCs/>
-              </w:rPr>
-              <w:t xml:space="preserve">Repository URL</w:t>
+            <w:tcBorders>
+              <w:top w:val="single" w:color="CBD5E1" w:sz="4"/>
+              <w:left w:val="single" w:color="CBD5E1" w:sz="4"/>
+              <w:bottom w:val="single" w:color="CBD5E1" w:sz="4"/>
+              <w:right w:val="single" w:color="CBD5E1" w:sz="4"/>
+            </w:tcBorders>
+          </w:tcPr>
+          <w:p>
+            <w:pPr>
+              <w:spacing w:after="60" w:before="60"/>
+            </w:pPr>
+            <w:r>
+              <w:rPr>
+                <w:rFonts w:ascii="Segoe UI" w:cs="Segoe UI" w:eastAsia="Segoe UI" w:hAnsi="Segoe UI"/>
+                <w:b w:val="false"/>
+                <w:bCs w:val="false"/>
+                <w:color w:val="0F172A"/>
+                <w:sz w:val="20"/>
+                <w:szCs w:val="20"/>
+              </w:rPr>
+              <w:t xml:space="preserve">Peer Reviewer (GitHub)</w:t>
             </w:r>
           </w:p>
         </w:tc>
         <w:tc>
           <w:tcPr>
             <w:tcW w:type="pct" w:w="70%"/>
-          </w:tcPr>
-          <w:p>
-            <w:pPr>
-              <w:spacing w:after="120"/>
-            </w:pPr>
-            <w:r>
-              <w:rPr>
-                <w:rFonts w:ascii="Segoe UI" w:cs="Segoe UI" w:eastAsia="Segoe UI" w:hAnsi="Segoe UI"/>
-                <w:b w:val="false"/>
-                <w:bCs w:val="false"/>
-              </w:rPr>
-              <w:t xml:space="preserve">https://github.com/vienggg/toktickit</w:t>
+            <w:tcBorders>
+              <w:top w:val="single" w:color="CBD5E1" w:sz="4"/>
+              <w:left w:val="single" w:color="CBD5E1" w:sz="4"/>
+              <w:bottom w:val="single" w:color="CBD5E1" w:sz="4"/>
+              <w:right w:val="single" w:color="CBD5E1" w:sz="4"/>
+            </w:tcBorders>
+          </w:tcPr>
+          <w:p>
+            <w:pPr>
+              <w:spacing w:after="60" w:before="60"/>
+            </w:pPr>
+            <w:r>
+              <w:rPr>
+                <w:rFonts w:ascii="Segoe UI" w:cs="Segoe UI" w:eastAsia="Segoe UI" w:hAnsi="Segoe UI"/>
+                <w:b w:val="false"/>
+                <w:bCs w:val="false"/>
+                <w:color w:val="0F172A"/>
+                <w:sz w:val="20"/>
+                <w:szCs w:val="20"/>
+              </w:rPr>
+              <w:t xml:space="preserve">Dechayut (@NinjoMUDA)</w:t>
             </w:r>
           </w:p>
         </w:tc>
@@ -169,36 +226,54 @@
         <w:tc>
           <w:tcPr>
             <w:tcW w:type="pct" w:w="30%"/>
-          </w:tcPr>
-          <w:p>
-            <w:pPr>
-              <w:spacing w:after="120"/>
-            </w:pPr>
-            <w:r>
-              <w:rPr>
-                <w:rFonts w:ascii="Segoe UI" w:cs="Segoe UI" w:eastAsia="Segoe UI" w:hAnsi="Segoe UI"/>
-                <w:b/>
-                <w:bCs/>
-              </w:rPr>
-              <w:t xml:space="preserve">Partner Repository</w:t>
+            <w:tcBorders>
+              <w:top w:val="single" w:color="CBD5E1" w:sz="4"/>
+              <w:left w:val="single" w:color="CBD5E1" w:sz="4"/>
+              <w:bottom w:val="single" w:color="CBD5E1" w:sz="4"/>
+              <w:right w:val="single" w:color="CBD5E1" w:sz="4"/>
+            </w:tcBorders>
+          </w:tcPr>
+          <w:p>
+            <w:pPr>
+              <w:spacing w:after="60" w:before="60"/>
+            </w:pPr>
+            <w:r>
+              <w:rPr>
+                <w:rFonts w:ascii="Segoe UI" w:cs="Segoe UI" w:eastAsia="Segoe UI" w:hAnsi="Segoe UI"/>
+                <w:b w:val="false"/>
+                <w:bCs w:val="false"/>
+                <w:color w:val="0F172A"/>
+                <w:sz w:val="20"/>
+                <w:szCs w:val="20"/>
+              </w:rPr>
+              <w:t xml:space="preserve">Project Repository</w:t>
             </w:r>
           </w:p>
         </w:tc>
         <w:tc>
           <w:tcPr>
             <w:tcW w:type="pct" w:w="70%"/>
-          </w:tcPr>
-          <w:p>
-            <w:pPr>
-              <w:spacing w:after="120"/>
-            </w:pPr>
-            <w:r>
-              <w:rPr>
-                <w:rFonts w:ascii="Segoe UI" w:cs="Segoe UI" w:eastAsia="Segoe UI" w:hAnsi="Segoe UI"/>
-                <w:b w:val="false"/>
-                <w:bCs w:val="false"/>
-              </w:rPr>
-              <w:t xml:space="preserve">https://github.com/NinjoMUDA/Dechayut_3414Lab1</w:t>
+            <w:tcBorders>
+              <w:top w:val="single" w:color="CBD5E1" w:sz="4"/>
+              <w:left w:val="single" w:color="CBD5E1" w:sz="4"/>
+              <w:bottom w:val="single" w:color="CBD5E1" w:sz="4"/>
+              <w:right w:val="single" w:color="CBD5E1" w:sz="4"/>
+            </w:tcBorders>
+          </w:tcPr>
+          <w:p>
+            <w:pPr>
+              <w:spacing w:after="60" w:before="60"/>
+            </w:pPr>
+            <w:r>
+              <w:rPr>
+                <w:rFonts w:ascii="Segoe UI" w:cs="Segoe UI" w:eastAsia="Segoe UI" w:hAnsi="Segoe UI"/>
+                <w:b w:val="false"/>
+                <w:bCs w:val="false"/>
+                <w:color w:val="0F172A"/>
+                <w:sz w:val="20"/>
+                <w:szCs w:val="20"/>
+              </w:rPr>
+              <w:t xml:space="preserve">https://github.com/vienggg/toktickit</w:t>
             </w:r>
           </w:p>
         </w:tc>
@@ -207,16 +282,81 @@
         <w:tc>
           <w:tcPr>
             <w:tcW w:type="pct" w:w="30%"/>
-          </w:tcPr>
-          <w:p>
-            <w:pPr>
-              <w:spacing w:after="120"/>
-            </w:pPr>
-            <w:r>
-              <w:rPr>
-                <w:rFonts w:ascii="Segoe UI" w:cs="Segoe UI" w:eastAsia="Segoe UI" w:hAnsi="Segoe UI"/>
-                <w:b/>
-                <w:bCs/>
+            <w:tcBorders>
+              <w:top w:val="single" w:color="CBD5E1" w:sz="4"/>
+              <w:left w:val="single" w:color="CBD5E1" w:sz="4"/>
+              <w:bottom w:val="single" w:color="CBD5E1" w:sz="4"/>
+              <w:right w:val="single" w:color="CBD5E1" w:sz="4"/>
+            </w:tcBorders>
+          </w:tcPr>
+          <w:p>
+            <w:pPr>
+              <w:spacing w:after="60" w:before="60"/>
+            </w:pPr>
+            <w:r>
+              <w:rPr>
+                <w:rFonts w:ascii="Segoe UI" w:cs="Segoe UI" w:eastAsia="Segoe UI" w:hAnsi="Segoe UI"/>
+                <w:b w:val="false"/>
+                <w:bCs w:val="false"/>
+                <w:color w:val="0F172A"/>
+                <w:sz w:val="20"/>
+                <w:szCs w:val="20"/>
+              </w:rPr>
+              <w:t xml:space="preserve">Partner Repository</w:t>
+            </w:r>
+          </w:p>
+        </w:tc>
+        <w:tc>
+          <w:tcPr>
+            <w:tcW w:type="pct" w:w="70%"/>
+            <w:tcBorders>
+              <w:top w:val="single" w:color="CBD5E1" w:sz="4"/>
+              <w:left w:val="single" w:color="CBD5E1" w:sz="4"/>
+              <w:bottom w:val="single" w:color="CBD5E1" w:sz="4"/>
+              <w:right w:val="single" w:color="CBD5E1" w:sz="4"/>
+            </w:tcBorders>
+          </w:tcPr>
+          <w:p>
+            <w:pPr>
+              <w:spacing w:after="60" w:before="60"/>
+            </w:pPr>
+            <w:r>
+              <w:rPr>
+                <w:rFonts w:ascii="Segoe UI" w:cs="Segoe UI" w:eastAsia="Segoe UI" w:hAnsi="Segoe UI"/>
+                <w:b w:val="false"/>
+                <w:bCs w:val="false"/>
+                <w:color w:val="0F172A"/>
+                <w:sz w:val="20"/>
+                <w:szCs w:val="20"/>
+              </w:rPr>
+              <w:t xml:space="preserve">https://github.com/NinjoMUDA/Dechayut_3414Lab1</w:t>
+            </w:r>
+          </w:p>
+        </w:tc>
+      </w:tr>
+      <w:tr>
+        <w:tc>
+          <w:tcPr>
+            <w:tcW w:type="pct" w:w="30%"/>
+            <w:tcBorders>
+              <w:top w:val="single" w:color="CBD5E1" w:sz="4"/>
+              <w:left w:val="single" w:color="CBD5E1" w:sz="4"/>
+              <w:bottom w:val="single" w:color="CBD5E1" w:sz="4"/>
+              <w:right w:val="single" w:color="CBD5E1" w:sz="4"/>
+            </w:tcBorders>
+          </w:tcPr>
+          <w:p>
+            <w:pPr>
+              <w:spacing w:after="60" w:before="60"/>
+            </w:pPr>
+            <w:r>
+              <w:rPr>
+                <w:rFonts w:ascii="Segoe UI" w:cs="Segoe UI" w:eastAsia="Segoe UI" w:hAnsi="Segoe UI"/>
+                <w:b w:val="false"/>
+                <w:bCs w:val="false"/>
+                <w:color w:val="0F172A"/>
+                <w:sz w:val="20"/>
+                <w:szCs w:val="20"/>
               </w:rPr>
               <w:t xml:space="preserve">GitHub Project Board</w:t>
             </w:r>
@@ -225,16 +365,25 @@
         <w:tc>
           <w:tcPr>
             <w:tcW w:type="pct" w:w="70%"/>
-          </w:tcPr>
-          <w:p>
-            <w:pPr>
-              <w:spacing w:after="120"/>
-            </w:pPr>
-            <w:r>
-              <w:rPr>
-                <w:rFonts w:ascii="Segoe UI" w:cs="Segoe UI" w:eastAsia="Segoe UI" w:hAnsi="Segoe UI"/>
-                <w:b w:val="false"/>
-                <w:bCs w:val="false"/>
+            <w:tcBorders>
+              <w:top w:val="single" w:color="CBD5E1" w:sz="4"/>
+              <w:left w:val="single" w:color="CBD5E1" w:sz="4"/>
+              <w:bottom w:val="single" w:color="CBD5E1" w:sz="4"/>
+              <w:right w:val="single" w:color="CBD5E1" w:sz="4"/>
+            </w:tcBorders>
+          </w:tcPr>
+          <w:p>
+            <w:pPr>
+              <w:spacing w:after="60" w:before="60"/>
+            </w:pPr>
+            <w:r>
+              <w:rPr>
+                <w:rFonts w:ascii="Segoe UI" w:cs="Segoe UI" w:eastAsia="Segoe UI" w:hAnsi="Segoe UI"/>
+                <w:b w:val="false"/>
+                <w:bCs w:val="false"/>
+                <w:color w:val="0F172A"/>
+                <w:sz w:val="20"/>
+                <w:szCs w:val="20"/>
               </w:rPr>
               <w:t xml:space="preserve">https://github.com/users/vienggg/projects/1</w:t>
             </w:r>
@@ -244,10 +393,17 @@
     </w:tbl>
     <w:p>
       <w:pPr>
-        <w:pStyle w:val="Heading1"/>
-        <w:spacing w:after="120" w:before="240"/>
-      </w:pPr>
-      <w:r>
+        <w:spacing w:after="120" w:before="300"/>
+      </w:pPr>
+      <w:r>
+        <w:rPr>
+          <w:rFonts w:ascii="Segoe UI" w:cs="Segoe UI" w:eastAsia="Segoe UI" w:hAnsi="Segoe UI"/>
+          <w:b/>
+          <w:bCs/>
+          <w:color w:val="2F7A4F"/>
+          <w:sz w:val="28"/>
+          <w:szCs w:val="28"/>
+        </w:rPr>
         <w:t xml:space="preserve">Answer Part 1: Project Foundation &amp; Environment Setup</w:t>
       </w:r>
     </w:p>
@@ -260,16 +416,25 @@
           <w:rFonts w:ascii="Segoe UI" w:cs="Segoe UI" w:eastAsia="Segoe UI" w:hAnsi="Segoe UI"/>
           <w:b w:val="false"/>
           <w:bCs w:val="false"/>
+          <w:sz w:val="21"/>
+          <w:szCs w:val="21"/>
         </w:rPr>
-        <w:t xml:space="preserve">Issue 1 focused on setting up the core full-stack project foundation for TokTickIT. We installed node modules in both server/ and client/ packages, configured environment files from .env.example templates, verified TypeScript compilation without errors, and committed the changes to feature/1-project-foundation before submitting Pull Request #1 to lab1-staging.</w:t>
+        <w:t xml:space="preserve">Issue 1 established the full-stack foundation for TokTickIT. We installed npm dependencies for both server/ and client/ packages, configured environment files (.env) from template examples (.env.example), verified TypeScript compilation without errors, and submitted Pull Request #1 from feature/1-project-foundation to lab1-staging.</w:t>
       </w:r>
     </w:p>
     <w:p>
       <w:pPr>
-        <w:pStyle w:val="Heading2"/>
-        <w:spacing w:after="120" w:before="240"/>
-      </w:pPr>
-      <w:r>
+        <w:spacing w:after="120" w:before="300"/>
+      </w:pPr>
+      <w:r>
+        <w:rPr>
+          <w:rFonts w:ascii="Segoe UI" w:cs="Segoe UI" w:eastAsia="Segoe UI" w:hAnsi="Segoe UI"/>
+          <w:b/>
+          <w:bCs/>
+          <w:color w:val="2F7A4F"/>
+          <w:sz w:val="28"/>
+          <w:szCs w:val="28"/>
+        </w:rPr>
         <w:t xml:space="preserve">Answer Part 2: API Health Check Implementation</w:t>
       </w:r>
     </w:p>
@@ -282,16 +447,25 @@
           <w:rFonts w:ascii="Segoe UI" w:cs="Segoe UI" w:eastAsia="Segoe UI" w:hAnsi="Segoe UI"/>
           <w:b w:val="false"/>
           <w:bCs w:val="false"/>
+          <w:sz w:val="21"/>
+          <w:szCs w:val="21"/>
         </w:rPr>
-        <w:t xml:space="preserve">Issue 2 implemented the GET /api/health endpoint in server/src/app.ts, returning HTTP 200 OK with JSON response { status: 'ok', service: 'TokTickIT API' }. The endpoint execution was verified using Supertest in server/tests/lab-01/health.test.ts, passing all 1 test suite checks.</w:t>
+        <w:t xml:space="preserve">Issue 2 implemented the GET /api/health endpoint in server/src/app.ts returning HTTP 200 OK with JSON response { status: 'ok', service: 'TokTickIT API' }. The endpoint was validated using Supertest in server/tests/lab-01/health.test.ts, passing 1/1 test suite checks.</w:t>
       </w:r>
     </w:p>
     <w:p>
       <w:pPr>
-        <w:pStyle w:val="Heading2"/>
-        <w:spacing w:after="120" w:before="240"/>
-      </w:pPr>
-      <w:r>
+        <w:spacing w:after="120" w:before="300"/>
+      </w:pPr>
+      <w:r>
+        <w:rPr>
+          <w:rFonts w:ascii="Segoe UI" w:cs="Segoe UI" w:eastAsia="Segoe UI" w:hAnsi="Segoe UI"/>
+          <w:b/>
+          <w:bCs/>
+          <w:color w:val="2F7A4F"/>
+          <w:sz w:val="28"/>
+          <w:szCs w:val="28"/>
+        </w:rPr>
         <w:t xml:space="preserve">Answer Part 3: Category Model &amp; Idempotent Seeding</w:t>
       </w:r>
     </w:p>
@@ -304,16 +478,25 @@
           <w:rFonts w:ascii="Segoe UI" w:cs="Segoe UI" w:eastAsia="Segoe UI" w:hAnsi="Segoe UI"/>
           <w:b w:val="false"/>
           <w:bCs w:val="false"/>
+          <w:sz w:val="21"/>
+          <w:szCs w:val="21"/>
         </w:rPr>
-        <w:t xml:space="preserve">Issue 3 defined the Category model in server/prisma/schema.prisma (containing id, name, and createdAt fields) and implemented an idempotent seed script in server/prisma/seed.ts using Prisma's upsert API. The seed script inserts four standard IT request categories: 'Account and Access', 'Hardware', 'Software', and 'Network'.</w:t>
+        <w:t xml:space="preserve">Issue 3 defined the Category model in server/prisma/schema.prisma (containing id, name, and createdAt fields) and implemented an idempotent seed script in server/prisma/seed.ts using Prisma's upsert API. The seed script inserts four standard IT categories: 'Account and Access', 'Hardware', 'Software', and 'Network'.</w:t>
       </w:r>
     </w:p>
     <w:p>
       <w:pPr>
-        <w:pStyle w:val="Heading2"/>
-        <w:spacing w:after="120" w:before="240"/>
-      </w:pPr>
-      <w:r>
+        <w:spacing w:after="120" w:before="300"/>
+      </w:pPr>
+      <w:r>
+        <w:rPr>
+          <w:rFonts w:ascii="Segoe UI" w:cs="Segoe UI" w:eastAsia="Segoe UI" w:hAnsi="Segoe UI"/>
+          <w:b/>
+          <w:bCs/>
+          <w:color w:val="2F7A4F"/>
+          <w:sz w:val="28"/>
+          <w:szCs w:val="28"/>
+        </w:rPr>
         <w:t xml:space="preserve">Answer Part 4: Category List API, React UI, &amp; Testing Evidence</w:t>
       </w:r>
     </w:p>
@@ -326,17 +509,752 @@
           <w:rFonts w:ascii="Segoe UI" w:cs="Segoe UI" w:eastAsia="Segoe UI" w:hAnsi="Segoe UI"/>
           <w:b w:val="false"/>
           <w:bCs w:val="false"/>
+          <w:sz w:val="21"/>
+          <w:szCs w:val="21"/>
         </w:rPr>
-        <w:t xml:space="preserve">Issue 4 created the GET /api/categories endpoint returning categories sorted by ID in ascending order. In the frontend, client/src/api.ts checkSystem() method fetches both health and categories endpoints. The React UI in client/src/App.tsx presents a clean Bootstrap layout displaying Loading state, Success state ('Online' badge + 4 categories), and Error state ('Offline' badge). Vitest component tests in client/tests/lab-01/App.test.tsx passed 3/3 tests.</w:t>
+        <w:t xml:space="preserve">Issue 4 created the GET /api/categories endpoint returning seeded categories ordered by ID ascending. In the frontend, client/src/api.ts checkSystem() method fetches health and categories endpoints. The React UI in client/src/App.tsx presents a clean Bootstrap layout displaying Loading state, Success state ('Online' badge + 4 categories), and Error state ('Offline' badge). Vitest component tests in client/tests/lab-01/App.test.tsx passed 3/3 tests.</w:t>
       </w:r>
     </w:p>
     <w:p>
       <w:pPr>
-        <w:pStyle w:val="Heading1"/>
-        <w:spacing w:after="120" w:before="240"/>
-      </w:pPr>
-      <w:r>
-        <w:t xml:space="preserve">Peer Review &amp; Kanban Board Summary</w:t>
+        <w:spacing w:after="100" w:before="200"/>
+      </w:pPr>
+      <w:r>
+        <w:rPr>
+          <w:rFonts w:ascii="Segoe UI" w:cs="Segoe UI" w:eastAsia="Segoe UI" w:hAnsi="Segoe UI"/>
+          <w:b/>
+          <w:bCs/>
+          <w:color w:val="1E293B"/>
+          <w:sz w:val="24"/>
+          <w:szCs w:val="24"/>
+        </w:rPr>
+        <w:t xml:space="preserve">Test Plan &amp; Execution Evidence</w:t>
+      </w:r>
+    </w:p>
+    <w:tbl>
+      <w:tblPr>
+        <w:tblW w:type="pct" w:w="100%"/>
+        <w:tblBorders>
+          <w:top w:val="single" w:color="auto" w:sz="4"/>
+          <w:left w:val="single" w:color="auto" w:sz="4"/>
+          <w:bottom w:val="single" w:color="auto" w:sz="4"/>
+          <w:right w:val="single" w:color="auto" w:sz="4"/>
+          <w:insideH w:val="single" w:color="auto" w:sz="4"/>
+          <w:insideV w:val="single" w:color="auto" w:sz="4"/>
+        </w:tblBorders>
+      </w:tblPr>
+      <w:tblGrid>
+        <w:gridCol w:w="100"/>
+        <w:gridCol w:w="100"/>
+        <w:gridCol w:w="100"/>
+        <w:gridCol w:w="100"/>
+        <w:gridCol w:w="100"/>
+      </w:tblGrid>
+      <w:tr>
+        <w:tc>
+          <w:tcPr>
+            <w:tcW w:type="pct" w:w="10%"/>
+            <w:tcBorders>
+              <w:top w:val="single" w:color="CBD5E1" w:sz="4"/>
+              <w:left w:val="single" w:color="CBD5E1" w:sz="4"/>
+              <w:bottom w:val="single" w:color="CBD5E1" w:sz="4"/>
+              <w:right w:val="single" w:color="CBD5E1" w:sz="4"/>
+            </w:tcBorders>
+            <w:shd w:fill="2F7A4F" w:val="clear"/>
+          </w:tcPr>
+          <w:p>
+            <w:pPr>
+              <w:spacing w:after="60" w:before="60"/>
+            </w:pPr>
+            <w:r>
+              <w:rPr>
+                <w:rFonts w:ascii="Segoe UI" w:cs="Segoe UI" w:eastAsia="Segoe UI" w:hAnsi="Segoe UI"/>
+                <w:b/>
+                <w:bCs/>
+                <w:color w:val="FFFFFF"/>
+                <w:sz w:val="20"/>
+                <w:szCs w:val="20"/>
+              </w:rPr>
+              <w:t xml:space="preserve">#</w:t>
+            </w:r>
+          </w:p>
+        </w:tc>
+        <w:tc>
+          <w:tcPr>
+            <w:tcW w:type="pct" w:w="20%"/>
+            <w:tcBorders>
+              <w:top w:val="single" w:color="CBD5E1" w:sz="4"/>
+              <w:left w:val="single" w:color="CBD5E1" w:sz="4"/>
+              <w:bottom w:val="single" w:color="CBD5E1" w:sz="4"/>
+              <w:right w:val="single" w:color="CBD5E1" w:sz="4"/>
+            </w:tcBorders>
+            <w:shd w:fill="2F7A4F" w:val="clear"/>
+          </w:tcPr>
+          <w:p>
+            <w:pPr>
+              <w:spacing w:after="60" w:before="60"/>
+            </w:pPr>
+            <w:r>
+              <w:rPr>
+                <w:rFonts w:ascii="Segoe UI" w:cs="Segoe UI" w:eastAsia="Segoe UI" w:hAnsi="Segoe UI"/>
+                <w:b/>
+                <w:bCs/>
+                <w:color w:val="FFFFFF"/>
+                <w:sz w:val="20"/>
+                <w:szCs w:val="20"/>
+              </w:rPr>
+              <w:t xml:space="preserve">Tool</w:t>
+            </w:r>
+          </w:p>
+        </w:tc>
+        <w:tc>
+          <w:tcPr>
+            <w:tcW w:type="pct" w:w="35%"/>
+            <w:tcBorders>
+              <w:top w:val="single" w:color="CBD5E1" w:sz="4"/>
+              <w:left w:val="single" w:color="CBD5E1" w:sz="4"/>
+              <w:bottom w:val="single" w:color="CBD5E1" w:sz="4"/>
+              <w:right w:val="single" w:color="CBD5E1" w:sz="4"/>
+            </w:tcBorders>
+            <w:shd w:fill="2F7A4F" w:val="clear"/>
+          </w:tcPr>
+          <w:p>
+            <w:pPr>
+              <w:spacing w:after="60" w:before="60"/>
+            </w:pPr>
+            <w:r>
+              <w:rPr>
+                <w:rFonts w:ascii="Segoe UI" w:cs="Segoe UI" w:eastAsia="Segoe UI" w:hAnsi="Segoe UI"/>
+                <w:b/>
+                <w:bCs/>
+                <w:color w:val="FFFFFF"/>
+                <w:sz w:val="20"/>
+                <w:szCs w:val="20"/>
+              </w:rPr>
+              <w:t xml:space="preserve">Test File</w:t>
+            </w:r>
+          </w:p>
+        </w:tc>
+        <w:tc>
+          <w:tcPr>
+            <w:tcW w:type="pct" w:w="25%"/>
+            <w:tcBorders>
+              <w:top w:val="single" w:color="CBD5E1" w:sz="4"/>
+              <w:left w:val="single" w:color="CBD5E1" w:sz="4"/>
+              <w:bottom w:val="single" w:color="CBD5E1" w:sz="4"/>
+              <w:right w:val="single" w:color="CBD5E1" w:sz="4"/>
+            </w:tcBorders>
+            <w:shd w:fill="2F7A4F" w:val="clear"/>
+          </w:tcPr>
+          <w:p>
+            <w:pPr>
+              <w:spacing w:after="60" w:before="60"/>
+            </w:pPr>
+            <w:r>
+              <w:rPr>
+                <w:rFonts w:ascii="Segoe UI" w:cs="Segoe UI" w:eastAsia="Segoe UI" w:hAnsi="Segoe UI"/>
+                <w:b/>
+                <w:bCs/>
+                <w:color w:val="FFFFFF"/>
+                <w:sz w:val="20"/>
+                <w:szCs w:val="20"/>
+              </w:rPr>
+              <w:t xml:space="preserve">Description</w:t>
+            </w:r>
+          </w:p>
+        </w:tc>
+        <w:tc>
+          <w:tcPr>
+            <w:tcW w:type="pct" w:w="10%"/>
+            <w:tcBorders>
+              <w:top w:val="single" w:color="CBD5E1" w:sz="4"/>
+              <w:left w:val="single" w:color="CBD5E1" w:sz="4"/>
+              <w:bottom w:val="single" w:color="CBD5E1" w:sz="4"/>
+              <w:right w:val="single" w:color="CBD5E1" w:sz="4"/>
+            </w:tcBorders>
+            <w:shd w:fill="2F7A4F" w:val="clear"/>
+          </w:tcPr>
+          <w:p>
+            <w:pPr>
+              <w:spacing w:after="60" w:before="60"/>
+            </w:pPr>
+            <w:r>
+              <w:rPr>
+                <w:rFonts w:ascii="Segoe UI" w:cs="Segoe UI" w:eastAsia="Segoe UI" w:hAnsi="Segoe UI"/>
+                <w:b/>
+                <w:bCs/>
+                <w:color w:val="FFFFFF"/>
+                <w:sz w:val="20"/>
+                <w:szCs w:val="20"/>
+              </w:rPr>
+              <w:t xml:space="preserve">Result</w:t>
+            </w:r>
+          </w:p>
+        </w:tc>
+      </w:tr>
+      <w:tr>
+        <w:tc>
+          <w:tcPr>
+            <w:tcW w:type="pct" w:w="10%"/>
+            <w:tcBorders>
+              <w:top w:val="single" w:color="CBD5E1" w:sz="4"/>
+              <w:left w:val="single" w:color="CBD5E1" w:sz="4"/>
+              <w:bottom w:val="single" w:color="CBD5E1" w:sz="4"/>
+              <w:right w:val="single" w:color="CBD5E1" w:sz="4"/>
+            </w:tcBorders>
+          </w:tcPr>
+          <w:p>
+            <w:pPr>
+              <w:spacing w:after="60" w:before="60"/>
+            </w:pPr>
+            <w:r>
+              <w:rPr>
+                <w:rFonts w:ascii="Segoe UI" w:cs="Segoe UI" w:eastAsia="Segoe UI" w:hAnsi="Segoe UI"/>
+                <w:b w:val="false"/>
+                <w:bCs w:val="false"/>
+                <w:color w:val="0F172A"/>
+                <w:sz w:val="20"/>
+                <w:szCs w:val="20"/>
+              </w:rPr>
+              <w:t xml:space="preserve">1</w:t>
+            </w:r>
+          </w:p>
+        </w:tc>
+        <w:tc>
+          <w:tcPr>
+            <w:tcW w:type="pct" w:w="20%"/>
+            <w:tcBorders>
+              <w:top w:val="single" w:color="CBD5E1" w:sz="4"/>
+              <w:left w:val="single" w:color="CBD5E1" w:sz="4"/>
+              <w:bottom w:val="single" w:color="CBD5E1" w:sz="4"/>
+              <w:right w:val="single" w:color="CBD5E1" w:sz="4"/>
+            </w:tcBorders>
+          </w:tcPr>
+          <w:p>
+            <w:pPr>
+              <w:spacing w:after="60" w:before="60"/>
+            </w:pPr>
+            <w:r>
+              <w:rPr>
+                <w:rFonts w:ascii="Segoe UI" w:cs="Segoe UI" w:eastAsia="Segoe UI" w:hAnsi="Segoe UI"/>
+                <w:b w:val="false"/>
+                <w:bCs w:val="false"/>
+                <w:color w:val="0F172A"/>
+                <w:sz w:val="20"/>
+                <w:szCs w:val="20"/>
+              </w:rPr>
+              <w:t xml:space="preserve">Supertest</w:t>
+            </w:r>
+          </w:p>
+        </w:tc>
+        <w:tc>
+          <w:tcPr>
+            <w:tcW w:type="pct" w:w="35%"/>
+            <w:tcBorders>
+              <w:top w:val="single" w:color="CBD5E1" w:sz="4"/>
+              <w:left w:val="single" w:color="CBD5E1" w:sz="4"/>
+              <w:bottom w:val="single" w:color="CBD5E1" w:sz="4"/>
+              <w:right w:val="single" w:color="CBD5E1" w:sz="4"/>
+            </w:tcBorders>
+          </w:tcPr>
+          <w:p>
+            <w:pPr>
+              <w:spacing w:after="60" w:before="60"/>
+            </w:pPr>
+            <w:r>
+              <w:rPr>
+                <w:rFonts w:ascii="Segoe UI" w:cs="Segoe UI" w:eastAsia="Segoe UI" w:hAnsi="Segoe UI"/>
+                <w:b w:val="false"/>
+                <w:bCs w:val="false"/>
+                <w:color w:val="0F172A"/>
+                <w:sz w:val="20"/>
+                <w:szCs w:val="20"/>
+              </w:rPr>
+              <w:t xml:space="preserve">health.test.ts</w:t>
+            </w:r>
+          </w:p>
+        </w:tc>
+        <w:tc>
+          <w:tcPr>
+            <w:tcW w:type="pct" w:w="25%"/>
+            <w:tcBorders>
+              <w:top w:val="single" w:color="CBD5E1" w:sz="4"/>
+              <w:left w:val="single" w:color="CBD5E1" w:sz="4"/>
+              <w:bottom w:val="single" w:color="CBD5E1" w:sz="4"/>
+              <w:right w:val="single" w:color="CBD5E1" w:sz="4"/>
+            </w:tcBorders>
+          </w:tcPr>
+          <w:p>
+            <w:pPr>
+              <w:spacing w:after="60" w:before="60"/>
+            </w:pPr>
+            <w:r>
+              <w:rPr>
+                <w:rFonts w:ascii="Segoe UI" w:cs="Segoe UI" w:eastAsia="Segoe UI" w:hAnsi="Segoe UI"/>
+                <w:b w:val="false"/>
+                <w:bCs w:val="false"/>
+                <w:color w:val="0F172A"/>
+                <w:sz w:val="20"/>
+                <w:szCs w:val="20"/>
+              </w:rPr>
+              <w:t xml:space="preserve">GET /api/health returns 200 OK status</w:t>
+            </w:r>
+          </w:p>
+        </w:tc>
+        <w:tc>
+          <w:tcPr>
+            <w:tcW w:type="pct" w:w="10%"/>
+            <w:tcBorders>
+              <w:top w:val="single" w:color="CBD5E1" w:sz="4"/>
+              <w:left w:val="single" w:color="CBD5E1" w:sz="4"/>
+              <w:bottom w:val="single" w:color="CBD5E1" w:sz="4"/>
+              <w:right w:val="single" w:color="CBD5E1" w:sz="4"/>
+            </w:tcBorders>
+          </w:tcPr>
+          <w:p>
+            <w:pPr>
+              <w:spacing w:after="60" w:before="60"/>
+            </w:pPr>
+            <w:r>
+              <w:rPr>
+                <w:rFonts w:ascii="Segoe UI" w:cs="Segoe UI" w:eastAsia="Segoe UI" w:hAnsi="Segoe UI"/>
+                <w:b w:val="false"/>
+                <w:bCs w:val="false"/>
+                <w:color w:val="0F172A"/>
+                <w:sz w:val="20"/>
+                <w:szCs w:val="20"/>
+              </w:rPr>
+              <w:t xml:space="preserve">PASS</w:t>
+            </w:r>
+          </w:p>
+        </w:tc>
+      </w:tr>
+      <w:tr>
+        <w:tc>
+          <w:tcPr>
+            <w:tcW w:type="pct" w:w="10%"/>
+            <w:tcBorders>
+              <w:top w:val="single" w:color="CBD5E1" w:sz="4"/>
+              <w:left w:val="single" w:color="CBD5E1" w:sz="4"/>
+              <w:bottom w:val="single" w:color="CBD5E1" w:sz="4"/>
+              <w:right w:val="single" w:color="CBD5E1" w:sz="4"/>
+            </w:tcBorders>
+          </w:tcPr>
+          <w:p>
+            <w:pPr>
+              <w:spacing w:after="60" w:before="60"/>
+            </w:pPr>
+            <w:r>
+              <w:rPr>
+                <w:rFonts w:ascii="Segoe UI" w:cs="Segoe UI" w:eastAsia="Segoe UI" w:hAnsi="Segoe UI"/>
+                <w:b w:val="false"/>
+                <w:bCs w:val="false"/>
+                <w:color w:val="0F172A"/>
+                <w:sz w:val="20"/>
+                <w:szCs w:val="20"/>
+              </w:rPr>
+              <w:t xml:space="preserve">2</w:t>
+            </w:r>
+          </w:p>
+        </w:tc>
+        <w:tc>
+          <w:tcPr>
+            <w:tcW w:type="pct" w:w="20%"/>
+            <w:tcBorders>
+              <w:top w:val="single" w:color="CBD5E1" w:sz="4"/>
+              <w:left w:val="single" w:color="CBD5E1" w:sz="4"/>
+              <w:bottom w:val="single" w:color="CBD5E1" w:sz="4"/>
+              <w:right w:val="single" w:color="CBD5E1" w:sz="4"/>
+            </w:tcBorders>
+          </w:tcPr>
+          <w:p>
+            <w:pPr>
+              <w:spacing w:after="60" w:before="60"/>
+            </w:pPr>
+            <w:r>
+              <w:rPr>
+                <w:rFonts w:ascii="Segoe UI" w:cs="Segoe UI" w:eastAsia="Segoe UI" w:hAnsi="Segoe UI"/>
+                <w:b w:val="false"/>
+                <w:bCs w:val="false"/>
+                <w:color w:val="0F172A"/>
+                <w:sz w:val="20"/>
+                <w:szCs w:val="20"/>
+              </w:rPr>
+              <w:t xml:space="preserve">Vitest</w:t>
+            </w:r>
+          </w:p>
+        </w:tc>
+        <w:tc>
+          <w:tcPr>
+            <w:tcW w:type="pct" w:w="35%"/>
+            <w:tcBorders>
+              <w:top w:val="single" w:color="CBD5E1" w:sz="4"/>
+              <w:left w:val="single" w:color="CBD5E1" w:sz="4"/>
+              <w:bottom w:val="single" w:color="CBD5E1" w:sz="4"/>
+              <w:right w:val="single" w:color="CBD5E1" w:sz="4"/>
+            </w:tcBorders>
+          </w:tcPr>
+          <w:p>
+            <w:pPr>
+              <w:spacing w:after="60" w:before="60"/>
+            </w:pPr>
+            <w:r>
+              <w:rPr>
+                <w:rFonts w:ascii="Segoe UI" w:cs="Segoe UI" w:eastAsia="Segoe UI" w:hAnsi="Segoe UI"/>
+                <w:b w:val="false"/>
+                <w:bCs w:val="false"/>
+                <w:color w:val="0F172A"/>
+                <w:sz w:val="20"/>
+                <w:szCs w:val="20"/>
+              </w:rPr>
+              <w:t xml:space="preserve">App.test.tsx</w:t>
+            </w:r>
+          </w:p>
+        </w:tc>
+        <w:tc>
+          <w:tcPr>
+            <w:tcW w:type="pct" w:w="25%"/>
+            <w:tcBorders>
+              <w:top w:val="single" w:color="CBD5E1" w:sz="4"/>
+              <w:left w:val="single" w:color="CBD5E1" w:sz="4"/>
+              <w:bottom w:val="single" w:color="CBD5E1" w:sz="4"/>
+              <w:right w:val="single" w:color="CBD5E1" w:sz="4"/>
+            </w:tcBorders>
+          </w:tcPr>
+          <w:p>
+            <w:pPr>
+              <w:spacing w:after="60" w:before="60"/>
+            </w:pPr>
+            <w:r>
+              <w:rPr>
+                <w:rFonts w:ascii="Segoe UI" w:cs="Segoe UI" w:eastAsia="Segoe UI" w:hAnsi="Segoe UI"/>
+                <w:b w:val="false"/>
+                <w:bCs w:val="false"/>
+                <w:color w:val="0F172A"/>
+                <w:sz w:val="20"/>
+                <w:szCs w:val="20"/>
+              </w:rPr>
+              <w:t xml:space="preserve">Renders TokTickIT heading</w:t>
+            </w:r>
+          </w:p>
+        </w:tc>
+        <w:tc>
+          <w:tcPr>
+            <w:tcW w:type="pct" w:w="10%"/>
+            <w:tcBorders>
+              <w:top w:val="single" w:color="CBD5E1" w:sz="4"/>
+              <w:left w:val="single" w:color="CBD5E1" w:sz="4"/>
+              <w:bottom w:val="single" w:color="CBD5E1" w:sz="4"/>
+              <w:right w:val="single" w:color="CBD5E1" w:sz="4"/>
+            </w:tcBorders>
+          </w:tcPr>
+          <w:p>
+            <w:pPr>
+              <w:spacing w:after="60" w:before="60"/>
+            </w:pPr>
+            <w:r>
+              <w:rPr>
+                <w:rFonts w:ascii="Segoe UI" w:cs="Segoe UI" w:eastAsia="Segoe UI" w:hAnsi="Segoe UI"/>
+                <w:b w:val="false"/>
+                <w:bCs w:val="false"/>
+                <w:color w:val="0F172A"/>
+                <w:sz w:val="20"/>
+                <w:szCs w:val="20"/>
+              </w:rPr>
+              <w:t xml:space="preserve">PASS</w:t>
+            </w:r>
+          </w:p>
+        </w:tc>
+      </w:tr>
+      <w:tr>
+        <w:tc>
+          <w:tcPr>
+            <w:tcW w:type="pct" w:w="10%"/>
+            <w:tcBorders>
+              <w:top w:val="single" w:color="CBD5E1" w:sz="4"/>
+              <w:left w:val="single" w:color="CBD5E1" w:sz="4"/>
+              <w:bottom w:val="single" w:color="CBD5E1" w:sz="4"/>
+              <w:right w:val="single" w:color="CBD5E1" w:sz="4"/>
+            </w:tcBorders>
+          </w:tcPr>
+          <w:p>
+            <w:pPr>
+              <w:spacing w:after="60" w:before="60"/>
+            </w:pPr>
+            <w:r>
+              <w:rPr>
+                <w:rFonts w:ascii="Segoe UI" w:cs="Segoe UI" w:eastAsia="Segoe UI" w:hAnsi="Segoe UI"/>
+                <w:b w:val="false"/>
+                <w:bCs w:val="false"/>
+                <w:color w:val="0F172A"/>
+                <w:sz w:val="20"/>
+                <w:szCs w:val="20"/>
+              </w:rPr>
+              <w:t xml:space="preserve">3</w:t>
+            </w:r>
+          </w:p>
+        </w:tc>
+        <w:tc>
+          <w:tcPr>
+            <w:tcW w:type="pct" w:w="20%"/>
+            <w:tcBorders>
+              <w:top w:val="single" w:color="CBD5E1" w:sz="4"/>
+              <w:left w:val="single" w:color="CBD5E1" w:sz="4"/>
+              <w:bottom w:val="single" w:color="CBD5E1" w:sz="4"/>
+              <w:right w:val="single" w:color="CBD5E1" w:sz="4"/>
+            </w:tcBorders>
+          </w:tcPr>
+          <w:p>
+            <w:pPr>
+              <w:spacing w:after="60" w:before="60"/>
+            </w:pPr>
+            <w:r>
+              <w:rPr>
+                <w:rFonts w:ascii="Segoe UI" w:cs="Segoe UI" w:eastAsia="Segoe UI" w:hAnsi="Segoe UI"/>
+                <w:b w:val="false"/>
+                <w:bCs w:val="false"/>
+                <w:color w:val="0F172A"/>
+                <w:sz w:val="20"/>
+                <w:szCs w:val="20"/>
+              </w:rPr>
+              <w:t xml:space="preserve">Vitest</w:t>
+            </w:r>
+          </w:p>
+        </w:tc>
+        <w:tc>
+          <w:tcPr>
+            <w:tcW w:type="pct" w:w="35%"/>
+            <w:tcBorders>
+              <w:top w:val="single" w:color="CBD5E1" w:sz="4"/>
+              <w:left w:val="single" w:color="CBD5E1" w:sz="4"/>
+              <w:bottom w:val="single" w:color="CBD5E1" w:sz="4"/>
+              <w:right w:val="single" w:color="CBD5E1" w:sz="4"/>
+            </w:tcBorders>
+          </w:tcPr>
+          <w:p>
+            <w:pPr>
+              <w:spacing w:after="60" w:before="60"/>
+            </w:pPr>
+            <w:r>
+              <w:rPr>
+                <w:rFonts w:ascii="Segoe UI" w:cs="Segoe UI" w:eastAsia="Segoe UI" w:hAnsi="Segoe UI"/>
+                <w:b w:val="false"/>
+                <w:bCs w:val="false"/>
+                <w:color w:val="0F172A"/>
+                <w:sz w:val="20"/>
+                <w:szCs w:val="20"/>
+              </w:rPr>
+              <w:t xml:space="preserve">App.test.tsx</w:t>
+            </w:r>
+          </w:p>
+        </w:tc>
+        <w:tc>
+          <w:tcPr>
+            <w:tcW w:type="pct" w:w="25%"/>
+            <w:tcBorders>
+              <w:top w:val="single" w:color="CBD5E1" w:sz="4"/>
+              <w:left w:val="single" w:color="CBD5E1" w:sz="4"/>
+              <w:bottom w:val="single" w:color="CBD5E1" w:sz="4"/>
+              <w:right w:val="single" w:color="CBD5E1" w:sz="4"/>
+            </w:tcBorders>
+          </w:tcPr>
+          <w:p>
+            <w:pPr>
+              <w:spacing w:after="60" w:before="60"/>
+            </w:pPr>
+            <w:r>
+              <w:rPr>
+                <w:rFonts w:ascii="Segoe UI" w:cs="Segoe UI" w:eastAsia="Segoe UI" w:hAnsi="Segoe UI"/>
+                <w:b w:val="false"/>
+                <w:bCs w:val="false"/>
+                <w:color w:val="0F172A"/>
+                <w:sz w:val="20"/>
+                <w:szCs w:val="20"/>
+              </w:rPr>
+              <w:t xml:space="preserve">Shows Online badge &amp; categories</w:t>
+            </w:r>
+          </w:p>
+        </w:tc>
+        <w:tc>
+          <w:tcPr>
+            <w:tcW w:type="pct" w:w="10%"/>
+            <w:tcBorders>
+              <w:top w:val="single" w:color="CBD5E1" w:sz="4"/>
+              <w:left w:val="single" w:color="CBD5E1" w:sz="4"/>
+              <w:bottom w:val="single" w:color="CBD5E1" w:sz="4"/>
+              <w:right w:val="single" w:color="CBD5E1" w:sz="4"/>
+            </w:tcBorders>
+          </w:tcPr>
+          <w:p>
+            <w:pPr>
+              <w:spacing w:after="60" w:before="60"/>
+            </w:pPr>
+            <w:r>
+              <w:rPr>
+                <w:rFonts w:ascii="Segoe UI" w:cs="Segoe UI" w:eastAsia="Segoe UI" w:hAnsi="Segoe UI"/>
+                <w:b w:val="false"/>
+                <w:bCs w:val="false"/>
+                <w:color w:val="0F172A"/>
+                <w:sz w:val="20"/>
+                <w:szCs w:val="20"/>
+              </w:rPr>
+              <w:t xml:space="preserve">PASS</w:t>
+            </w:r>
+          </w:p>
+        </w:tc>
+      </w:tr>
+      <w:tr>
+        <w:tc>
+          <w:tcPr>
+            <w:tcW w:type="pct" w:w="10%"/>
+            <w:tcBorders>
+              <w:top w:val="single" w:color="CBD5E1" w:sz="4"/>
+              <w:left w:val="single" w:color="CBD5E1" w:sz="4"/>
+              <w:bottom w:val="single" w:color="CBD5E1" w:sz="4"/>
+              <w:right w:val="single" w:color="CBD5E1" w:sz="4"/>
+            </w:tcBorders>
+          </w:tcPr>
+          <w:p>
+            <w:pPr>
+              <w:spacing w:after="60" w:before="60"/>
+            </w:pPr>
+            <w:r>
+              <w:rPr>
+                <w:rFonts w:ascii="Segoe UI" w:cs="Segoe UI" w:eastAsia="Segoe UI" w:hAnsi="Segoe UI"/>
+                <w:b w:val="false"/>
+                <w:bCs w:val="false"/>
+                <w:color w:val="0F172A"/>
+                <w:sz w:val="20"/>
+                <w:szCs w:val="20"/>
+              </w:rPr>
+              <w:t xml:space="preserve">4</w:t>
+            </w:r>
+          </w:p>
+        </w:tc>
+        <w:tc>
+          <w:tcPr>
+            <w:tcW w:type="pct" w:w="20%"/>
+            <w:tcBorders>
+              <w:top w:val="single" w:color="CBD5E1" w:sz="4"/>
+              <w:left w:val="single" w:color="CBD5E1" w:sz="4"/>
+              <w:bottom w:val="single" w:color="CBD5E1" w:sz="4"/>
+              <w:right w:val="single" w:color="CBD5E1" w:sz="4"/>
+            </w:tcBorders>
+          </w:tcPr>
+          <w:p>
+            <w:pPr>
+              <w:spacing w:after="60" w:before="60"/>
+            </w:pPr>
+            <w:r>
+              <w:rPr>
+                <w:rFonts w:ascii="Segoe UI" w:cs="Segoe UI" w:eastAsia="Segoe UI" w:hAnsi="Segoe UI"/>
+                <w:b w:val="false"/>
+                <w:bCs w:val="false"/>
+                <w:color w:val="0F172A"/>
+                <w:sz w:val="20"/>
+                <w:szCs w:val="20"/>
+              </w:rPr>
+              <w:t xml:space="preserve">Vitest</w:t>
+            </w:r>
+          </w:p>
+        </w:tc>
+        <w:tc>
+          <w:tcPr>
+            <w:tcW w:type="pct" w:w="35%"/>
+            <w:tcBorders>
+              <w:top w:val="single" w:color="CBD5E1" w:sz="4"/>
+              <w:left w:val="single" w:color="CBD5E1" w:sz="4"/>
+              <w:bottom w:val="single" w:color="CBD5E1" w:sz="4"/>
+              <w:right w:val="single" w:color="CBD5E1" w:sz="4"/>
+            </w:tcBorders>
+          </w:tcPr>
+          <w:p>
+            <w:pPr>
+              <w:spacing w:after="60" w:before="60"/>
+            </w:pPr>
+            <w:r>
+              <w:rPr>
+                <w:rFonts w:ascii="Segoe UI" w:cs="Segoe UI" w:eastAsia="Segoe UI" w:hAnsi="Segoe UI"/>
+                <w:b w:val="false"/>
+                <w:bCs w:val="false"/>
+                <w:color w:val="0F172A"/>
+                <w:sz w:val="20"/>
+                <w:szCs w:val="20"/>
+              </w:rPr>
+              <w:t xml:space="preserve">App.test.tsx</w:t>
+            </w:r>
+          </w:p>
+        </w:tc>
+        <w:tc>
+          <w:tcPr>
+            <w:tcW w:type="pct" w:w="25%"/>
+            <w:tcBorders>
+              <w:top w:val="single" w:color="CBD5E1" w:sz="4"/>
+              <w:left w:val="single" w:color="CBD5E1" w:sz="4"/>
+              <w:bottom w:val="single" w:color="CBD5E1" w:sz="4"/>
+              <w:right w:val="single" w:color="CBD5E1" w:sz="4"/>
+            </w:tcBorders>
+          </w:tcPr>
+          <w:p>
+            <w:pPr>
+              <w:spacing w:after="60" w:before="60"/>
+            </w:pPr>
+            <w:r>
+              <w:rPr>
+                <w:rFonts w:ascii="Segoe UI" w:cs="Segoe UI" w:eastAsia="Segoe UI" w:hAnsi="Segoe UI"/>
+                <w:b w:val="false"/>
+                <w:bCs w:val="false"/>
+                <w:color w:val="0F172A"/>
+                <w:sz w:val="20"/>
+                <w:szCs w:val="20"/>
+              </w:rPr>
+              <w:t xml:space="preserve">Shows Offline badge on error</w:t>
+            </w:r>
+          </w:p>
+        </w:tc>
+        <w:tc>
+          <w:tcPr>
+            <w:tcW w:type="pct" w:w="10%"/>
+            <w:tcBorders>
+              <w:top w:val="single" w:color="CBD5E1" w:sz="4"/>
+              <w:left w:val="single" w:color="CBD5E1" w:sz="4"/>
+              <w:bottom w:val="single" w:color="CBD5E1" w:sz="4"/>
+              <w:right w:val="single" w:color="CBD5E1" w:sz="4"/>
+            </w:tcBorders>
+          </w:tcPr>
+          <w:p>
+            <w:pPr>
+              <w:spacing w:after="60" w:before="60"/>
+            </w:pPr>
+            <w:r>
+              <w:rPr>
+                <w:rFonts w:ascii="Segoe UI" w:cs="Segoe UI" w:eastAsia="Segoe UI" w:hAnsi="Segoe UI"/>
+                <w:b w:val="false"/>
+                <w:bCs w:val="false"/>
+                <w:color w:val="0F172A"/>
+                <w:sz w:val="20"/>
+                <w:szCs w:val="20"/>
+              </w:rPr>
+              <w:t xml:space="preserve">PASS</w:t>
+            </w:r>
+          </w:p>
+        </w:tc>
+      </w:tr>
+    </w:tbl>
+    <w:p>
+      <w:pPr>
+        <w:spacing w:after="100" w:before="200"/>
+      </w:pPr>
+      <w:r>
+        <w:rPr>
+          <w:rFonts w:ascii="Segoe UI" w:cs="Segoe UI" w:eastAsia="Segoe UI" w:hAnsi="Segoe UI"/>
+          <w:b/>
+          <w:bCs/>
+          <w:color w:val="1E293B"/>
+          <w:sz w:val="24"/>
+          <w:szCs w:val="24"/>
+        </w:rPr>
+        <w:t xml:space="preserve">AI Use &amp; Prompt Engineering Log (Claude Opus 4.6 &amp; Gemini 3.6 Flash)</w:t>
       </w:r>
     </w:p>
     <w:p>
@@ -348,30 +1266,10 @@
           <w:rFonts w:ascii="Segoe UI" w:cs="Segoe UI" w:eastAsia="Segoe UI" w:hAnsi="Segoe UI"/>
           <w:b w:val="false"/>
           <w:bCs w:val="false"/>
+          <w:sz w:val="21"/>
+          <w:szCs w:val="21"/>
         </w:rPr>
-        <w:t xml:space="preserve">Submitted paragraph peer review comments on all 4 PRs in NinjoMUDA/Dechayut_3414Lab1. Created GitHub Project #1 'TokTickIT Individual Sprints' and configured Kanban columns: Backlog, Specified, Started, PR Review, Fixing, Done.</w:t>
-      </w:r>
-    </w:p>
-    <w:p>
-      <w:pPr>
-        <w:pStyle w:val="Heading1"/>
-        <w:spacing w:after="120" w:before="240"/>
-      </w:pPr>
-      <w:r>
-        <w:t xml:space="preserve">AI Prompts &amp; Reflection Summary</w:t>
-      </w:r>
-    </w:p>
-    <w:p>
-      <w:pPr>
-        <w:spacing w:after="120"/>
-      </w:pPr>
-      <w:r>
-        <w:rPr>
-          <w:rFonts w:ascii="Segoe UI" w:cs="Segoe UI" w:eastAsia="Segoe UI" w:hAnsi="Segoe UI"/>
-          <w:b w:val="false"/>
-          <w:bCs w:val="false"/>
-        </w:rPr>
-        <w:t xml:space="preserve">Used Claude Opus 4.6 and Gemini 3.6 Flash via Antigravity Coding Assistant. Established _AI_EXECUTION_RULES.md (Ask-First protocol, peer review approval before merge, markdown edit transparency, and dynamic mode toggles) and docs/session_state.md to ensure seamless context handoffs across sessions or tools.</w:t>
+        <w:t xml:space="preserve">Established custom project governance rules in _AI_EXECUTION_RULES.md (Ask-First protocol, mandatory peer review approvals before merge, markdown edit transparency, and dynamic mode toggles) alongside docs/session_state.md. As rules evolved, these living documents ensured that if I stop using Antigravity and switch to another AI tool altogether, any new AI assistant can immediately comprehend the full codebase history, git state, and execution standards without friction.</w:t>
       </w:r>
     </w:p>
     <w:sectPr>

</xml_diff>

<commit_message>
docs: add screenshot placeholder containers and figure captions to report_lab01.docx
</commit_message>
<xml_diff>
--- a/docs/report_lab01.docx
+++ b/docs/report_lab01.docx
@@ -4,7 +4,7 @@
   <w:body>
     <w:p>
       <w:pPr>
-        <w:spacing w:after="60" w:before="200"/>
+        <w:spacing w:after="60" w:before="180"/>
         <w:jc w:val="center"/>
       </w:pPr>
       <w:r>
@@ -21,7 +21,7 @@
     </w:p>
     <w:p>
       <w:pPr>
-        <w:spacing w:after="300"/>
+        <w:spacing w:after="240"/>
         <w:jc w:val="center"/>
       </w:pPr>
       <w:r>
@@ -30,8 +30,8 @@
           <w:b/>
           <w:bCs/>
           <w:color w:val="1E293B"/>
-          <w:sz w:val="26"/>
-          <w:szCs w:val="26"/>
+          <w:sz w:val="24"/>
+          <w:szCs w:val="24"/>
         </w:rPr>
         <w:t xml:space="preserve">TokTickIT IT Service Desk Starter</w:t>
       </w:r>
@@ -393,7 +393,7 @@
     </w:tbl>
     <w:p>
       <w:pPr>
-        <w:spacing w:after="120" w:before="300"/>
+        <w:spacing w:after="100" w:before="280"/>
       </w:pPr>
       <w:r>
         <w:rPr>
@@ -401,15 +401,15 @@
           <w:b/>
           <w:bCs/>
           <w:color w:val="2F7A4F"/>
-          <w:sz w:val="28"/>
-          <w:szCs w:val="28"/>
+          <w:sz w:val="26"/>
+          <w:szCs w:val="26"/>
         </w:rPr>
         <w:t xml:space="preserve">Answer Part 1: Project Foundation &amp; Environment Setup</w:t>
       </w:r>
     </w:p>
     <w:p>
       <w:pPr>
-        <w:spacing w:after="120"/>
+        <w:spacing w:after="100"/>
       </w:pPr>
       <w:r>
         <w:rPr>
@@ -419,12 +419,74 @@
           <w:sz w:val="21"/>
           <w:szCs w:val="21"/>
         </w:rPr>
-        <w:t xml:space="preserve">Issue 1 established the full-stack foundation for TokTickIT. We installed npm dependencies for both server/ and client/ packages, configured environment files (.env) from template examples (.env.example), verified TypeScript compilation without errors, and submitted Pull Request #1 from feature/1-project-foundation to lab1-staging.</w:t>
-      </w:r>
-    </w:p>
-    <w:p>
-      <w:pPr>
-        <w:spacing w:after="120" w:before="300"/>
+        <w:t xml:space="preserve">Issue 1 established the core full-stack foundation for TokTickIT. Dependencies were installed for server/ and client/ packages, environment files (.env) configured from .env.example templates, and TypeScript compilation verified without errors before submitting PR #1 from feature/1-project-foundation to lab1-staging.</w:t>
+      </w:r>
+    </w:p>
+    <w:tbl>
+      <w:tblPr>
+        <w:tblW w:type="pct" w:w="100%"/>
+        <w:tblBorders>
+          <w:top w:val="single" w:color="auto" w:sz="4"/>
+          <w:left w:val="single" w:color="auto" w:sz="4"/>
+          <w:bottom w:val="single" w:color="auto" w:sz="4"/>
+          <w:right w:val="single" w:color="auto" w:sz="4"/>
+          <w:insideH w:val="single" w:color="auto" w:sz="4"/>
+          <w:insideV w:val="single" w:color="auto" w:sz="4"/>
+        </w:tblBorders>
+      </w:tblPr>
+      <w:tblGrid>
+        <w:gridCol w:w="100"/>
+      </w:tblGrid>
+      <w:tr>
+        <w:tc>
+          <w:tcPr>
+            <w:tcW w:type="pct" w:w="100%"/>
+            <w:tcBorders>
+              <w:top w:val="single" w:color="CBD5E1" w:sz="4"/>
+              <w:left w:val="single" w:color="CBD5E1" w:sz="4"/>
+              <w:bottom w:val="single" w:color="CBD5E1" w:sz="4"/>
+              <w:right w:val="single" w:color="CBD5E1" w:sz="4"/>
+            </w:tcBorders>
+            <w:shd w:fill="F1F5F9" w:val="clear"/>
+          </w:tcPr>
+          <w:p>
+            <w:pPr>
+              <w:spacing w:after="240" w:before="240"/>
+              <w:jc w:val="center"/>
+            </w:pPr>
+            <w:r>
+              <w:rPr>
+                <w:rFonts w:ascii="Segoe UI" w:cs="Segoe UI" w:eastAsia="Segoe UI" w:hAnsi="Segoe UI"/>
+                <w:b/>
+                <w:bCs/>
+                <w:color w:val="475569"/>
+                <w:sz w:val="20"/>
+                <w:szCs w:val="20"/>
+              </w:rPr>
+              <w:t xml:space="preserve">📷 [ SCREENSHOT EVIDENCE PLACEHOLDER: Git Flow Branches &amp; PR Merged to lab1-staging ]</w:t>
+            </w:r>
+          </w:p>
+        </w:tc>
+      </w:tr>
+    </w:tbl>
+    <w:p>
+      <w:pPr>
+        <w:spacing w:after="180" w:before="60"/>
+        <w:jc w:val="center"/>
+      </w:pPr>
+      <w:r>
+        <w:rPr>
+          <w:rFonts w:ascii="Segoe UI" w:cs="Segoe UI" w:eastAsia="Segoe UI" w:hAnsi="Segoe UI"/>
+          <w:color w:val="64748B"/>
+          <w:sz w:val="18"/>
+          <w:szCs w:val="18"/>
+        </w:rPr>
+        <w:t xml:space="preserve">Figure 1: GitHub Pull Request #1 merged into lab1-staging showing clean branch history</w:t>
+      </w:r>
+    </w:p>
+    <w:p>
+      <w:pPr>
+        <w:spacing w:after="100" w:before="280"/>
       </w:pPr>
       <w:r>
         <w:rPr>
@@ -432,15 +494,15 @@
           <w:b/>
           <w:bCs/>
           <w:color w:val="2F7A4F"/>
-          <w:sz w:val="28"/>
-          <w:szCs w:val="28"/>
+          <w:sz w:val="26"/>
+          <w:szCs w:val="26"/>
         </w:rPr>
         <w:t xml:space="preserve">Answer Part 2: API Health Check Implementation</w:t>
       </w:r>
     </w:p>
     <w:p>
       <w:pPr>
-        <w:spacing w:after="120"/>
+        <w:spacing w:after="100"/>
       </w:pPr>
       <w:r>
         <w:rPr>
@@ -450,12 +512,74 @@
           <w:sz w:val="21"/>
           <w:szCs w:val="21"/>
         </w:rPr>
-        <w:t xml:space="preserve">Issue 2 implemented the GET /api/health endpoint in server/src/app.ts returning HTTP 200 OK with JSON response { status: 'ok', service: 'TokTickIT API' }. The endpoint was validated using Supertest in server/tests/lab-01/health.test.ts, passing 1/1 test suite checks.</w:t>
-      </w:r>
-    </w:p>
-    <w:p>
-      <w:pPr>
-        <w:spacing w:after="120" w:before="300"/>
+        <w:t xml:space="preserve">Issue 2 implemented the GET /api/health endpoint in server/src/app.ts returning HTTP 200 OK with JSON response { status: 'ok', service: 'TokTickIT API' }. Validated via Supertest in server/tests/lab-01/health.test.ts, passing 1/1 test suite checks.</w:t>
+      </w:r>
+    </w:p>
+    <w:tbl>
+      <w:tblPr>
+        <w:tblW w:type="pct" w:w="100%"/>
+        <w:tblBorders>
+          <w:top w:val="single" w:color="auto" w:sz="4"/>
+          <w:left w:val="single" w:color="auto" w:sz="4"/>
+          <w:bottom w:val="single" w:color="auto" w:sz="4"/>
+          <w:right w:val="single" w:color="auto" w:sz="4"/>
+          <w:insideH w:val="single" w:color="auto" w:sz="4"/>
+          <w:insideV w:val="single" w:color="auto" w:sz="4"/>
+        </w:tblBorders>
+      </w:tblPr>
+      <w:tblGrid>
+        <w:gridCol w:w="100"/>
+      </w:tblGrid>
+      <w:tr>
+        <w:tc>
+          <w:tcPr>
+            <w:tcW w:type="pct" w:w="100%"/>
+            <w:tcBorders>
+              <w:top w:val="single" w:color="CBD5E1" w:sz="4"/>
+              <w:left w:val="single" w:color="CBD5E1" w:sz="4"/>
+              <w:bottom w:val="single" w:color="CBD5E1" w:sz="4"/>
+              <w:right w:val="single" w:color="CBD5E1" w:sz="4"/>
+            </w:tcBorders>
+            <w:shd w:fill="F1F5F9" w:val="clear"/>
+          </w:tcPr>
+          <w:p>
+            <w:pPr>
+              <w:spacing w:after="240" w:before="240"/>
+              <w:jc w:val="center"/>
+            </w:pPr>
+            <w:r>
+              <w:rPr>
+                <w:rFonts w:ascii="Segoe UI" w:cs="Segoe UI" w:eastAsia="Segoe UI" w:hAnsi="Segoe UI"/>
+                <w:b/>
+                <w:bCs/>
+                <w:color w:val="475569"/>
+                <w:sz w:val="20"/>
+                <w:szCs w:val="20"/>
+              </w:rPr>
+              <w:t xml:space="preserve">📷 [ SCREENSHOT EVIDENCE PLACEHOLDER: Supertest GET /api/health Terminal Test Output ]</w:t>
+            </w:r>
+          </w:p>
+        </w:tc>
+      </w:tr>
+    </w:tbl>
+    <w:p>
+      <w:pPr>
+        <w:spacing w:after="180" w:before="60"/>
+        <w:jc w:val="center"/>
+      </w:pPr>
+      <w:r>
+        <w:rPr>
+          <w:rFonts w:ascii="Segoe UI" w:cs="Segoe UI" w:eastAsia="Segoe UI" w:hAnsi="Segoe UI"/>
+          <w:color w:val="64748B"/>
+          <w:sz w:val="18"/>
+          <w:szCs w:val="18"/>
+        </w:rPr>
+        <w:t xml:space="preserve">Figure 2: Supertest integration test output verifying 200 OK response from /api/health</w:t>
+      </w:r>
+    </w:p>
+    <w:p>
+      <w:pPr>
+        <w:spacing w:after="100" w:before="280"/>
       </w:pPr>
       <w:r>
         <w:rPr>
@@ -463,15 +587,15 @@
           <w:b/>
           <w:bCs/>
           <w:color w:val="2F7A4F"/>
-          <w:sz w:val="28"/>
-          <w:szCs w:val="28"/>
+          <w:sz w:val="26"/>
+          <w:szCs w:val="26"/>
         </w:rPr>
         <w:t xml:space="preserve">Answer Part 3: Category Model &amp; Idempotent Seeding</w:t>
       </w:r>
     </w:p>
     <w:p>
       <w:pPr>
-        <w:spacing w:after="120"/>
+        <w:spacing w:after="100"/>
       </w:pPr>
       <w:r>
         <w:rPr>
@@ -481,12 +605,74 @@
           <w:sz w:val="21"/>
           <w:szCs w:val="21"/>
         </w:rPr>
-        <w:t xml:space="preserve">Issue 3 defined the Category model in server/prisma/schema.prisma (containing id, name, and createdAt fields) and implemented an idempotent seed script in server/prisma/seed.ts using Prisma's upsert API. The seed script inserts four standard IT categories: 'Account and Access', 'Hardware', 'Software', and 'Network'.</w:t>
-      </w:r>
-    </w:p>
-    <w:p>
-      <w:pPr>
-        <w:spacing w:after="120" w:before="300"/>
+        <w:t xml:space="preserve">Issue 3 defined the Category model in server/prisma/schema.prisma (containing id, name, and createdAt fields) and implemented an idempotent seed script in server/prisma/seed.ts using Prisma's upsert API. The seed script populates four standard IT request categories: 'Account and Access', 'Hardware', 'Software', and 'Network'.</w:t>
+      </w:r>
+    </w:p>
+    <w:tbl>
+      <w:tblPr>
+        <w:tblW w:type="pct" w:w="100%"/>
+        <w:tblBorders>
+          <w:top w:val="single" w:color="auto" w:sz="4"/>
+          <w:left w:val="single" w:color="auto" w:sz="4"/>
+          <w:bottom w:val="single" w:color="auto" w:sz="4"/>
+          <w:right w:val="single" w:color="auto" w:sz="4"/>
+          <w:insideH w:val="single" w:color="auto" w:sz="4"/>
+          <w:insideV w:val="single" w:color="auto" w:sz="4"/>
+        </w:tblBorders>
+      </w:tblPr>
+      <w:tblGrid>
+        <w:gridCol w:w="100"/>
+      </w:tblGrid>
+      <w:tr>
+        <w:tc>
+          <w:tcPr>
+            <w:tcW w:type="pct" w:w="100%"/>
+            <w:tcBorders>
+              <w:top w:val="single" w:color="CBD5E1" w:sz="4"/>
+              <w:left w:val="single" w:color="CBD5E1" w:sz="4"/>
+              <w:bottom w:val="single" w:color="CBD5E1" w:sz="4"/>
+              <w:right w:val="single" w:color="CBD5E1" w:sz="4"/>
+            </w:tcBorders>
+            <w:shd w:fill="F1F5F9" w:val="clear"/>
+          </w:tcPr>
+          <w:p>
+            <w:pPr>
+              <w:spacing w:after="240" w:before="240"/>
+              <w:jc w:val="center"/>
+            </w:pPr>
+            <w:r>
+              <w:rPr>
+                <w:rFonts w:ascii="Segoe UI" w:cs="Segoe UI" w:eastAsia="Segoe UI" w:hAnsi="Segoe UI"/>
+                <w:b/>
+                <w:bCs/>
+                <w:color w:val="475569"/>
+                <w:sz w:val="20"/>
+                <w:szCs w:val="20"/>
+              </w:rPr>
+              <w:t xml:space="preserve">📷 [ SCREENSHOT EVIDENCE PLACEHOLDER: Prisma Schema &amp; Idempotent Seeding Execution ]</w:t>
+            </w:r>
+          </w:p>
+        </w:tc>
+      </w:tr>
+    </w:tbl>
+    <w:p>
+      <w:pPr>
+        <w:spacing w:after="180" w:before="60"/>
+        <w:jc w:val="center"/>
+      </w:pPr>
+      <w:r>
+        <w:rPr>
+          <w:rFonts w:ascii="Segoe UI" w:cs="Segoe UI" w:eastAsia="Segoe UI" w:hAnsi="Segoe UI"/>
+          <w:color w:val="64748B"/>
+          <w:sz w:val="18"/>
+          <w:szCs w:val="18"/>
+        </w:rPr>
+        <w:t xml:space="preserve">Figure 3: Prisma schema definition and seed output populating 4 IT request categories</w:t>
+      </w:r>
+    </w:p>
+    <w:p>
+      <w:pPr>
+        <w:spacing w:after="100" w:before="280"/>
       </w:pPr>
       <w:r>
         <w:rPr>
@@ -494,15 +680,15 @@
           <w:b/>
           <w:bCs/>
           <w:color w:val="2F7A4F"/>
-          <w:sz w:val="28"/>
-          <w:szCs w:val="28"/>
+          <w:sz w:val="26"/>
+          <w:szCs w:val="26"/>
         </w:rPr>
         <w:t xml:space="preserve">Answer Part 4: Category List API, React UI, &amp; Testing Evidence</w:t>
       </w:r>
     </w:p>
     <w:p>
       <w:pPr>
-        <w:spacing w:after="120"/>
+        <w:spacing w:after="100"/>
       </w:pPr>
       <w:r>
         <w:rPr>
@@ -512,12 +698,136 @@
           <w:sz w:val="21"/>
           <w:szCs w:val="21"/>
         </w:rPr>
-        <w:t xml:space="preserve">Issue 4 created the GET /api/categories endpoint returning seeded categories ordered by ID ascending. In the frontend, client/src/api.ts checkSystem() method fetches health and categories endpoints. The React UI in client/src/App.tsx presents a clean Bootstrap layout displaying Loading state, Success state ('Online' badge + 4 categories), and Error state ('Offline' badge). Vitest component tests in client/tests/lab-01/App.test.tsx passed 3/3 tests.</w:t>
-      </w:r>
-    </w:p>
-    <w:p>
-      <w:pPr>
-        <w:spacing w:after="100" w:before="200"/>
+        <w:t xml:space="preserve">Issue 4 created the GET /api/categories endpoint returning categories ordered by ID ascending. In the frontend, client/src/api.ts checkSystem() method fetches health and categories endpoints. The React UI in client/src/App.tsx presents a clean Bootstrap layout displaying Loading state, Success state ('Online' badge + 4 categories), and Error state ('Offline' badge). Vitest component tests in client/tests/lab-01/App.test.tsx passed 3/3 tests.</w:t>
+      </w:r>
+    </w:p>
+    <w:tbl>
+      <w:tblPr>
+        <w:tblW w:type="pct" w:w="100%"/>
+        <w:tblBorders>
+          <w:top w:val="single" w:color="auto" w:sz="4"/>
+          <w:left w:val="single" w:color="auto" w:sz="4"/>
+          <w:bottom w:val="single" w:color="auto" w:sz="4"/>
+          <w:right w:val="single" w:color="auto" w:sz="4"/>
+          <w:insideH w:val="single" w:color="auto" w:sz="4"/>
+          <w:insideV w:val="single" w:color="auto" w:sz="4"/>
+        </w:tblBorders>
+      </w:tblPr>
+      <w:tblGrid>
+        <w:gridCol w:w="100"/>
+      </w:tblGrid>
+      <w:tr>
+        <w:tc>
+          <w:tcPr>
+            <w:tcW w:type="pct" w:w="100%"/>
+            <w:tcBorders>
+              <w:top w:val="single" w:color="CBD5E1" w:sz="4"/>
+              <w:left w:val="single" w:color="CBD5E1" w:sz="4"/>
+              <w:bottom w:val="single" w:color="CBD5E1" w:sz="4"/>
+              <w:right w:val="single" w:color="CBD5E1" w:sz="4"/>
+            </w:tcBorders>
+            <w:shd w:fill="F1F5F9" w:val="clear"/>
+          </w:tcPr>
+          <w:p>
+            <w:pPr>
+              <w:spacing w:after="240" w:before="240"/>
+              <w:jc w:val="center"/>
+            </w:pPr>
+            <w:r>
+              <w:rPr>
+                <w:rFonts w:ascii="Segoe UI" w:cs="Segoe UI" w:eastAsia="Segoe UI" w:hAnsi="Segoe UI"/>
+                <w:b/>
+                <w:bCs/>
+                <w:color w:val="475569"/>
+                <w:sz w:val="20"/>
+                <w:szCs w:val="20"/>
+              </w:rPr>
+              <w:t xml:space="preserve">📷 [ SCREENSHOT EVIDENCE PLACEHOLDER: TokTickIT React Application UI States (Online &amp; Categories List) ]</w:t>
+            </w:r>
+          </w:p>
+        </w:tc>
+      </w:tr>
+    </w:tbl>
+    <w:p>
+      <w:pPr>
+        <w:spacing w:after="180" w:before="60"/>
+        <w:jc w:val="center"/>
+      </w:pPr>
+      <w:r>
+        <w:rPr>
+          <w:rFonts w:ascii="Segoe UI" w:cs="Segoe UI" w:eastAsia="Segoe UI" w:hAnsi="Segoe UI"/>
+          <w:color w:val="64748B"/>
+          <w:sz w:val="18"/>
+          <w:szCs w:val="18"/>
+        </w:rPr>
+        <w:t xml:space="preserve">Figure 4: React UI rendering 'Online' badge with the 4 seeded categories in Bootstrap list format</w:t>
+      </w:r>
+    </w:p>
+    <w:tbl>
+      <w:tblPr>
+        <w:tblW w:type="pct" w:w="100%"/>
+        <w:tblBorders>
+          <w:top w:val="single" w:color="auto" w:sz="4"/>
+          <w:left w:val="single" w:color="auto" w:sz="4"/>
+          <w:bottom w:val="single" w:color="auto" w:sz="4"/>
+          <w:right w:val="single" w:color="auto" w:sz="4"/>
+          <w:insideH w:val="single" w:color="auto" w:sz="4"/>
+          <w:insideV w:val="single" w:color="auto" w:sz="4"/>
+        </w:tblBorders>
+      </w:tblPr>
+      <w:tblGrid>
+        <w:gridCol w:w="100"/>
+      </w:tblGrid>
+      <w:tr>
+        <w:tc>
+          <w:tcPr>
+            <w:tcW w:type="pct" w:w="100%"/>
+            <w:tcBorders>
+              <w:top w:val="single" w:color="CBD5E1" w:sz="4"/>
+              <w:left w:val="single" w:color="CBD5E1" w:sz="4"/>
+              <w:bottom w:val="single" w:color="CBD5E1" w:sz="4"/>
+              <w:right w:val="single" w:color="CBD5E1" w:sz="4"/>
+            </w:tcBorders>
+            <w:shd w:fill="F1F5F9" w:val="clear"/>
+          </w:tcPr>
+          <w:p>
+            <w:pPr>
+              <w:spacing w:after="240" w:before="240"/>
+              <w:jc w:val="center"/>
+            </w:pPr>
+            <w:r>
+              <w:rPr>
+                <w:rFonts w:ascii="Segoe UI" w:cs="Segoe UI" w:eastAsia="Segoe UI" w:hAnsi="Segoe UI"/>
+                <w:b/>
+                <w:bCs/>
+                <w:color w:val="475569"/>
+                <w:sz w:val="20"/>
+                <w:szCs w:val="20"/>
+              </w:rPr>
+              <w:t xml:space="preserve">📷 [ SCREENSHOT EVIDENCE PLACEHOLDER: GitHub Project Board Kanban View (Backlog to Done) ]</w:t>
+            </w:r>
+          </w:p>
+        </w:tc>
+      </w:tr>
+    </w:tbl>
+    <w:p>
+      <w:pPr>
+        <w:spacing w:after="180" w:before="60"/>
+        <w:jc w:val="center"/>
+      </w:pPr>
+      <w:r>
+        <w:rPr>
+          <w:rFonts w:ascii="Segoe UI" w:cs="Segoe UI" w:eastAsia="Segoe UI" w:hAnsi="Segoe UI"/>
+          <w:color w:val="64748B"/>
+          <w:sz w:val="18"/>
+          <w:szCs w:val="18"/>
+        </w:rPr>
+        <w:t xml:space="preserve">Figure 5: GitHub Project Board 'TokTickIT Individual Sprints' showing 6 columns with cards placed in PR Review and Done</w:t>
+      </w:r>
+    </w:p>
+    <w:p>
+      <w:pPr>
+        <w:spacing w:after="80" w:before="200"/>
       </w:pPr>
       <w:r>
         <w:rPr>
@@ -525,10 +835,10 @@
           <w:b/>
           <w:bCs/>
           <w:color w:val="1E293B"/>
-          <w:sz w:val="24"/>
-          <w:szCs w:val="24"/>
-        </w:rPr>
-        <w:t xml:space="preserve">Test Plan &amp; Execution Evidence</w:t>
+          <w:sz w:val="22"/>
+          <w:szCs w:val="22"/>
+        </w:rPr>
+        <w:t xml:space="preserve">Test Plan &amp; Execution Evidence Table</w:t>
       </w:r>
     </w:p>
     <w:tbl>
@@ -1243,7 +1553,7 @@
     </w:tbl>
     <w:p>
       <w:pPr>
-        <w:spacing w:after="100" w:before="200"/>
+        <w:spacing w:after="80" w:before="200"/>
       </w:pPr>
       <w:r>
         <w:rPr>
@@ -1251,15 +1561,15 @@
           <w:b/>
           <w:bCs/>
           <w:color w:val="1E293B"/>
-          <w:sz w:val="24"/>
-          <w:szCs w:val="24"/>
+          <w:sz w:val="22"/>
+          <w:szCs w:val="22"/>
         </w:rPr>
         <w:t xml:space="preserve">AI Use &amp; Prompt Engineering Log (Claude Opus 4.6 &amp; Gemini 3.6 Flash)</w:t>
       </w:r>
     </w:p>
     <w:p>
       <w:pPr>
-        <w:spacing w:after="120"/>
+        <w:spacing w:after="100"/>
       </w:pPr>
       <w:r>
         <w:rPr>
@@ -1269,7 +1579,7 @@
           <w:sz w:val="21"/>
           <w:szCs w:val="21"/>
         </w:rPr>
-        <w:t xml:space="preserve">Established custom project governance rules in _AI_EXECUTION_RULES.md (Ask-First protocol, mandatory peer review approvals before merge, markdown edit transparency, and dynamic mode toggles) alongside docs/session_state.md. As rules evolved, these living documents ensured that if I stop using Antigravity and switch to another AI tool altogether, any new AI assistant can immediately comprehend the full codebase history, git state, and execution standards without friction.</w:t>
+        <w:t xml:space="preserve">Established custom project governance rules in _AI_EXECUTION_RULES.md (Ask-First protocol, mandatory peer review approvals before merge, markdown edit transparency, and dynamic mode toggles) alongside docs/session_state.md. As rules evolved across sessions, these living documents ensured that if I stop using Antigravity and switch to another AI tool altogether, any new AI assistant can immediately comprehend the full codebase history, git state, and execution standards without friction.</w:t>
       </w:r>
     </w:p>
     <w:sectPr>

</xml_diff>